<commit_message>
413, resubmitted, adding introduction to summary report lebara
</commit_message>
<xml_diff>
--- a/2025-T3/T3B2-ICTNPL413-Eval_net_reg_legis/2-ICTNPL413-Task2/Assessmet-questions/Reports/ICTNPL413_AssessmentTask_Manuel_S_Perez_E-Summ-Rep-Lebara.docx
+++ b/2025-T3/T3B2-ICTNPL413-Eval_net_reg_legis/2-ICTNPL413-Task2/Assessmet-questions/Reports/ICTNPL413_AssessmentTask_Manuel_S_Perez_E-Summ-Rep-Lebara.docx
@@ -124,13 +124,108 @@
     </w:p>
     <w:p>
       <w:pPr>
-        <w:jc w:val="center"/>
-        <w:rPr>
-          <w:rFonts w:ascii="Arial" w:hAnsi="Arial" w:cs="Arial"/>
-          <w:b/>
-          <w:bCs/>
-        </w:rPr>
-      </w:pPr>
+        <w:rPr>
+          <w:rFonts w:ascii="Arial" w:hAnsi="Arial" w:cs="Arial"/>
+          <w:b/>
+          <w:bCs/>
+          <w:sz w:val="22"/>
+          <w:szCs w:val="22"/>
+        </w:rPr>
+      </w:pPr>
+    </w:p>
+    <w:p>
+      <w:pPr>
+        <w:jc w:val="both"/>
+        <w:rPr>
+          <w:rFonts w:ascii="Arial" w:hAnsi="Arial" w:cs="Arial"/>
+          <w:b/>
+          <w:bCs/>
+          <w:sz w:val="22"/>
+          <w:szCs w:val="22"/>
+        </w:rPr>
+      </w:pPr>
+      <w:r>
+        <w:rPr>
+          <w:rFonts w:ascii="Arial" w:hAnsi="Arial" w:cs="Arial"/>
+          <w:b/>
+          <w:bCs/>
+          <w:sz w:val="22"/>
+          <w:szCs w:val="22"/>
+        </w:rPr>
+        <w:t>Introduction</w:t>
+      </w:r>
+    </w:p>
+    <w:p>
+      <w:pPr>
+        <w:jc w:val="both"/>
+        <w:rPr>
+          <w:rFonts w:ascii="Arial" w:hAnsi="Arial" w:cs="Arial"/>
+          <w:sz w:val="22"/>
+          <w:szCs w:val="22"/>
+        </w:rPr>
+      </w:pPr>
+      <w:r>
+        <w:rPr>
+          <w:rFonts w:ascii="Arial" w:hAnsi="Arial" w:cs="Arial"/>
+          <w:sz w:val="22"/>
+          <w:szCs w:val="22"/>
+        </w:rPr>
+        <w:t>This report examines the Australian regulatory framework governing telecommunications, with a specific focus on its impact on Lebara's network service planning and accessibility. Its objectives are twofold: first, to demonstrate the critical role of regulation and oversight by bodies such as the Australian Communications and Media Authority (ACMA), the Australian Competition and Consumer Commission (ACCC), and the Office of the Australian Information Commissioner (OAIC) in fostering fair competition and protecting consumers; and second, to highlight the importance of compliance with accessibility and coverage obligations as a safeguard against reputational and operational risks.</w:t>
+      </w:r>
+    </w:p>
+    <w:p>
+      <w:pPr>
+        <w:jc w:val="both"/>
+        <w:rPr>
+          <w:rFonts w:ascii="Arial" w:hAnsi="Arial" w:cs="Arial"/>
+          <w:sz w:val="22"/>
+          <w:szCs w:val="22"/>
+        </w:rPr>
+      </w:pPr>
+      <w:r>
+        <w:rPr>
+          <w:rFonts w:ascii="Arial" w:hAnsi="Arial" w:cs="Arial"/>
+          <w:sz w:val="22"/>
+          <w:szCs w:val="22"/>
+        </w:rPr>
+        <w:t>The Australian telecommunications sector is dominated by a small number of carriers — Telstra, Optus, and TPG/Vodafone — which compete to deliver mobile, broadband, and fixed-line services across a vast and geographically diverse nation. Within this context, Mobile Virtual Network Operators (MVNOs) such as Lebara occupy a distinct but important niche, providing affordable, prepaid, and internationally focused services by accessing wholesale network infrastructure. Regulatory requirements such as the Universal Service Obligation (USO), consumer protection standards, and competition laws are essential for ensuring that network services remain accessible, reliable, and inclusive — even in rural and remote areas where commercial incentives to invest are limited.</w:t>
+      </w:r>
+    </w:p>
+    <w:p>
+      <w:pPr>
+        <w:jc w:val="both"/>
+        <w:rPr>
+          <w:rFonts w:ascii="Arial" w:hAnsi="Arial" w:cs="Arial"/>
+          <w:sz w:val="22"/>
+          <w:szCs w:val="22"/>
+        </w:rPr>
+      </w:pPr>
+      <w:r>
+        <w:rPr>
+          <w:rFonts w:ascii="Arial" w:hAnsi="Arial" w:cs="Arial"/>
+          <w:sz w:val="22"/>
+          <w:szCs w:val="22"/>
+        </w:rPr>
+        <w:t>Lebara, operating as an MVNO on the Optus wholesale network, functions within this complex environment of opportunity and scrutiny. The company has built a strong reputation among culturally and linguistically diverse communities by offering cost-effective prepaid plans with generous international calling inclusions, targeting migrant households, international students, and temporary workers. However, its reputation has also been challenged by a series of operational shortcomings, including billing irregularities, difficulties with number portability, inadequate complaint resolution, and misleading promotional offers. These incidents underscore why strict adherence to regulatory requirements, combined with transparent and ethical practices, is central not only to meeting legal obligations but also to sustaining consumer trust and long-term market competitiveness.</w:t>
+      </w:r>
+    </w:p>
+    <w:p>
+      <w:pPr>
+        <w:jc w:val="both"/>
+        <w:rPr>
+          <w:rFonts w:ascii="Arial" w:hAnsi="Arial" w:cs="Arial"/>
+          <w:b/>
+          <w:bCs/>
+        </w:rPr>
+      </w:pPr>
+      <w:r>
+        <w:rPr>
+          <w:rFonts w:ascii="Arial" w:hAnsi="Arial" w:cs="Arial"/>
+          <w:sz w:val="22"/>
+          <w:szCs w:val="22"/>
+        </w:rPr>
+        <w:t>This introduction provides the foundation for the analysis that follows, focusing on legislation and regulations, the current accessibility of Lebara's services, and the broader impact of compliance on its ability to deliver reliable, affordable, and equitable telecommunications to its diverse customer base across Australia.</w:t>
+      </w:r>
     </w:p>
     <w:p>
       <w:pPr>
@@ -161,7 +256,14 @@
         <w:rPr>
           <w:rFonts w:ascii="Arial" w:hAnsi="Arial" w:cs="Arial"/>
         </w:rPr>
-        <w:t xml:space="preserve">The Australian telecommunications industry operates within a complex and highly regulated framework designed to ensure fair competition, safeguard consumer interests, and guarantee universal access to essential services. For a provider such as </w:t>
+        <w:t xml:space="preserve">The Australian telecommunications industry operates within a complex and highly regulated framework designed to ensure fair competition, safeguard consumer </w:t>
+      </w:r>
+      <w:r>
+        <w:rPr>
+          <w:rFonts w:ascii="Arial" w:hAnsi="Arial" w:cs="Arial"/>
+        </w:rPr>
+        <w:lastRenderedPageBreak/>
+        <w:t xml:space="preserve">interests, and guarantee universal access to essential services. For a provider such as </w:t>
       </w:r>
       <w:r>
         <w:rPr>
@@ -387,7 +489,6 @@
           <w:b/>
           <w:bCs/>
         </w:rPr>
-        <w:lastRenderedPageBreak/>
         <w:t>Service Provider Licensing Obligations</w:t>
       </w:r>
     </w:p>
@@ -484,6 +585,7 @@
         <w:rPr>
           <w:rFonts w:ascii="Arial" w:hAnsi="Arial" w:cs="Arial"/>
         </w:rPr>
+        <w:lastRenderedPageBreak/>
         <w:t>Failure to meet these obligations exposes Lebara to regulatory sanctions and reputational harm, as illustrated by consumer complaints regarding billing errors and inadequate dispute resolution.</w:t>
       </w:r>
     </w:p>
@@ -662,59 +764,59 @@
           <w:b/>
           <w:bCs/>
         </w:rPr>
+        <w:t>Financing</w:t>
+      </w:r>
+      <w:r>
+        <w:rPr>
+          <w:rFonts w:ascii="Arial" w:hAnsi="Arial" w:cs="Arial"/>
+        </w:rPr>
+        <w:t>, under which Telstra receives approximately AUD 270 million annually, partly funded by contributions from competitors such as Optus and Vodafone, upon whose networks Lebara depends.</w:t>
+      </w:r>
+    </w:p>
+    <w:p>
+      <w:pPr>
+        <w:jc w:val="both"/>
+        <w:rPr>
+          <w:rFonts w:ascii="Arial" w:hAnsi="Arial" w:cs="Arial"/>
+        </w:rPr>
+      </w:pPr>
+      <w:r>
+        <w:rPr>
+          <w:rFonts w:ascii="Arial" w:hAnsi="Arial" w:cs="Arial"/>
+        </w:rPr>
+        <w:t>Lebara’s business model does not require it to build infrastructure in underserved regions; however, its participation in industry levies reflects the principle that all carriers benefit from a nationally accessible communications market. Moreover, the enforcement of consumer safeguard policies provides a framework within which Lebara must remedy its weaknesses in customer care, billing transparency, and service reliability.</w:t>
+      </w:r>
+    </w:p>
+    <w:p>
+      <w:pPr>
+        <w:jc w:val="both"/>
+        <w:rPr>
+          <w:rFonts w:ascii="Arial" w:hAnsi="Arial" w:cs="Arial"/>
+          <w:b/>
+          <w:bCs/>
+        </w:rPr>
+      </w:pPr>
+      <w:r>
+        <w:rPr>
+          <w:rFonts w:ascii="Arial" w:hAnsi="Arial" w:cs="Arial"/>
+          <w:b/>
+          <w:bCs/>
+        </w:rPr>
+        <w:t>Implications for Lebara</w:t>
+      </w:r>
+    </w:p>
+    <w:p>
+      <w:pPr>
+        <w:jc w:val="both"/>
+        <w:rPr>
+          <w:rFonts w:ascii="Arial" w:hAnsi="Arial" w:cs="Arial"/>
+        </w:rPr>
+      </w:pPr>
+      <w:r>
+        <w:rPr>
+          <w:rFonts w:ascii="Arial" w:hAnsi="Arial" w:cs="Arial"/>
+        </w:rPr>
         <w:lastRenderedPageBreak/>
-        <w:t>Financing</w:t>
-      </w:r>
-      <w:r>
-        <w:rPr>
-          <w:rFonts w:ascii="Arial" w:hAnsi="Arial" w:cs="Arial"/>
-        </w:rPr>
-        <w:t>, under which Telstra receives approximately AUD 270 million annually, partly funded by contributions from competitors such as Optus and Vodafone, upon whose networks Lebara depends.</w:t>
-      </w:r>
-    </w:p>
-    <w:p>
-      <w:pPr>
-        <w:jc w:val="both"/>
-        <w:rPr>
-          <w:rFonts w:ascii="Arial" w:hAnsi="Arial" w:cs="Arial"/>
-        </w:rPr>
-      </w:pPr>
-      <w:r>
-        <w:rPr>
-          <w:rFonts w:ascii="Arial" w:hAnsi="Arial" w:cs="Arial"/>
-        </w:rPr>
-        <w:t>Lebara’s business model does not require it to build infrastructure in underserved regions; however, its participation in industry levies reflects the principle that all carriers benefit from a nationally accessible communications market. Moreover, the enforcement of consumer safeguard policies provides a framework within which Lebara must remedy its weaknesses in customer care, billing transparency, and service reliability.</w:t>
-      </w:r>
-    </w:p>
-    <w:p>
-      <w:pPr>
-        <w:jc w:val="both"/>
-        <w:rPr>
-          <w:rFonts w:ascii="Arial" w:hAnsi="Arial" w:cs="Arial"/>
-          <w:b/>
-          <w:bCs/>
-        </w:rPr>
-      </w:pPr>
-      <w:r>
-        <w:rPr>
-          <w:rFonts w:ascii="Arial" w:hAnsi="Arial" w:cs="Arial"/>
-          <w:b/>
-          <w:bCs/>
-        </w:rPr>
-        <w:t>Implications for Lebara</w:t>
-      </w:r>
-    </w:p>
-    <w:p>
-      <w:pPr>
-        <w:jc w:val="both"/>
-        <w:rPr>
-          <w:rFonts w:ascii="Arial" w:hAnsi="Arial" w:cs="Arial"/>
-        </w:rPr>
-      </w:pPr>
-      <w:r>
-        <w:rPr>
-          <w:rFonts w:ascii="Arial" w:hAnsi="Arial" w:cs="Arial"/>
-        </w:rPr>
         <w:t>For Lebara, strict adherence to these legislative and regulatory requirements is not merely a matter of compliance but a pathway to rebuilding trust in a competitive market. The oversight of ACMA, ACCC, and OAIC ensures that issues such as misleading advertising, weak complaint handling, and data misuse—areas where Lebara has faced criticism—cannot be ignored. By aligning its operations with the expectations of the regulatory framework, Lebara has the opportunity to not only avoid sanctions but also reposition itself as a provider that prioritises fair treatment, accessibility, and consumer protection.</w:t>
       </w:r>
     </w:p>
@@ -807,64 +909,64 @@
         <w:rPr>
           <w:rFonts w:ascii="Arial" w:hAnsi="Arial" w:cs="Arial"/>
         </w:rPr>
-        <w:t xml:space="preserve"> remains Lebara’s strongest accessibility feature. The company has deliberately positioned itself as a low-cost provider, offering prepaid mobile plans that are often significantly cheaper than those of major carriers. These plans typically include competitive data packages and generous international calling inclusions, reflecting a business model that prioritises value-conscious customers. This has been particularly successful among migrant households, international students, and </w:t>
+        <w:t xml:space="preserve"> remains Lebara’s strongest accessibility feature. The company has deliberately positioned itself as a low-cost provider, offering prepaid mobile plans that are often significantly cheaper than those of major carriers. These plans typically include competitive data packages and generous international calling inclusions, reflecting a business model that prioritises value-conscious customers. This has been particularly successful among migrant households, international students, and temporary workers, for whom affordable international connectivity is a necessity. In this regard, Lebara contributes meaningfully to reducing the digital divide for low-income groups in Australia.</w:t>
+      </w:r>
+    </w:p>
+    <w:p>
+      <w:pPr>
+        <w:jc w:val="both"/>
+        <w:rPr>
+          <w:rFonts w:ascii="Arial" w:hAnsi="Arial" w:cs="Arial"/>
+        </w:rPr>
+      </w:pPr>
+      <w:r>
+        <w:rPr>
+          <w:rFonts w:ascii="Arial" w:hAnsi="Arial" w:cs="Arial"/>
+        </w:rPr>
+        <w:t xml:space="preserve">From an </w:t>
+      </w:r>
+      <w:r>
+        <w:rPr>
+          <w:rFonts w:ascii="Arial" w:hAnsi="Arial" w:cs="Arial"/>
+          <w:b/>
+          <w:bCs/>
+        </w:rPr>
+        <w:t>organisational perspective</w:t>
+      </w:r>
+      <w:r>
+        <w:rPr>
+          <w:rFonts w:ascii="Arial" w:hAnsi="Arial" w:cs="Arial"/>
+        </w:rPr>
+        <w:t>, however, Lebara’s accessibility is limited. While its offerings are attractive to sole traders or micro-enterprises that only require cost-effective mobile services, the lack of enterprise-grade products such as dedicated broadband, managed network services, or cybersecurity solutions renders it unsuitable for larger organisations. This lack of breadth constrains Lebara’s accessibility to the business sector, effectively limiting its reach to small-scale users.</w:t>
+      </w:r>
+    </w:p>
+    <w:p>
+      <w:pPr>
+        <w:jc w:val="both"/>
+        <w:rPr>
+          <w:rFonts w:ascii="Arial" w:hAnsi="Arial" w:cs="Arial"/>
+        </w:rPr>
+      </w:pPr>
+      <w:r>
+        <w:rPr>
+          <w:rFonts w:ascii="Arial" w:hAnsi="Arial" w:cs="Arial"/>
+          <w:b/>
+          <w:bCs/>
+        </w:rPr>
+        <w:t>Inclusivity</w:t>
+      </w:r>
+      <w:r>
+        <w:rPr>
+          <w:rFonts w:ascii="Arial" w:hAnsi="Arial" w:cs="Arial"/>
+        </w:rPr>
+        <w:t xml:space="preserve"> is another defining feature of Lebara’s market strategy. The company has distinguished itself by targeting culturally and linguistically diverse communities </w:t>
       </w:r>
       <w:r>
         <w:rPr>
           <w:rFonts w:ascii="Arial" w:hAnsi="Arial" w:cs="Arial"/>
         </w:rPr>
         <w:lastRenderedPageBreak/>
-        <w:t>temporary workers, for whom affordable international connectivity is a necessity. In this regard, Lebara contributes meaningfully to reducing the digital divide for low-income groups in Australia.</w:t>
-      </w:r>
-    </w:p>
-    <w:p>
-      <w:pPr>
-        <w:jc w:val="both"/>
-        <w:rPr>
-          <w:rFonts w:ascii="Arial" w:hAnsi="Arial" w:cs="Arial"/>
-        </w:rPr>
-      </w:pPr>
-      <w:r>
-        <w:rPr>
-          <w:rFonts w:ascii="Arial" w:hAnsi="Arial" w:cs="Arial"/>
-        </w:rPr>
-        <w:t xml:space="preserve">From an </w:t>
-      </w:r>
-      <w:r>
-        <w:rPr>
-          <w:rFonts w:ascii="Arial" w:hAnsi="Arial" w:cs="Arial"/>
-          <w:b/>
-          <w:bCs/>
-        </w:rPr>
-        <w:t>organisational perspective</w:t>
-      </w:r>
-      <w:r>
-        <w:rPr>
-          <w:rFonts w:ascii="Arial" w:hAnsi="Arial" w:cs="Arial"/>
-        </w:rPr>
-        <w:t>, however, Lebara’s accessibility is limited. While its offerings are attractive to sole traders or micro-enterprises that only require cost-effective mobile services, the lack of enterprise-grade products such as dedicated broadband, managed network services, or cybersecurity solutions renders it unsuitable for larger organisations. This lack of breadth constrains Lebara’s accessibility to the business sector, effectively limiting its reach to small-scale users.</w:t>
-      </w:r>
-    </w:p>
-    <w:p>
-      <w:pPr>
-        <w:jc w:val="both"/>
-        <w:rPr>
-          <w:rFonts w:ascii="Arial" w:hAnsi="Arial" w:cs="Arial"/>
-        </w:rPr>
-      </w:pPr>
-      <w:r>
-        <w:rPr>
-          <w:rFonts w:ascii="Arial" w:hAnsi="Arial" w:cs="Arial"/>
-          <w:b/>
-          <w:bCs/>
-        </w:rPr>
-        <w:t>Inclusivity</w:t>
-      </w:r>
-      <w:r>
-        <w:rPr>
-          <w:rFonts w:ascii="Arial" w:hAnsi="Arial" w:cs="Arial"/>
-        </w:rPr>
-        <w:t xml:space="preserve"> is another defining feature of Lebara’s market strategy. The company has distinguished itself by targeting culturally and linguistically diverse communities through multilingual customer support, culturally relevant marketing, and international call packages that meet the specific needs of migrant populations. These efforts enhance accessibility for groups that may feel underserved or overlooked by mainstream carriers. However, Lebara’s inclusivity does not extend as strongly to other vulnerable groups. For example, rural communities continue to face coverage gaps, and people with disabilities often rely more heavily on industry-wide services such as the National Relay Service rather than bespoke solutions from Lebara itself.</w:t>
+        <w:t>through multilingual customer support, culturally relevant marketing, and international call packages that meet the specific needs of migrant populations. These efforts enhance accessibility for groups that may feel underserved or overlooked by mainstream carriers. However, Lebara’s inclusivity does not extend as strongly to other vulnerable groups. For example, rural communities continue to face coverage gaps, and people with disabilities often rely more heavily on industry-wide services such as the National Relay Service rather than bespoke solutions from Lebara itself.</w:t>
       </w:r>
     </w:p>
     <w:p>
@@ -994,50 +1096,56 @@
         <w:rPr>
           <w:rFonts w:ascii="Arial" w:hAnsi="Arial" w:cs="Arial"/>
         </w:rPr>
+        <w:t xml:space="preserve">Lebara also provides consumer-centric procedures for </w:t>
+      </w:r>
+      <w:r>
+        <w:rPr>
+          <w:rFonts w:ascii="Arial" w:hAnsi="Arial" w:cs="Arial"/>
+          <w:b/>
+          <w:bCs/>
+        </w:rPr>
+        <w:t>complaints handling</w:t>
+      </w:r>
+      <w:r>
+        <w:rPr>
+          <w:rFonts w:ascii="Arial" w:hAnsi="Arial" w:cs="Arial"/>
+        </w:rPr>
+        <w:t>, including network outage complaints. These processes, overseen by ACMA’s regulatory requirements, are intended to improve transparency and accountability. However, past consumer grievances highlight weaknesses in Lebara’s responsiveness to complaints. While the existence of these mechanisms is a regulatory necessity, their effectiveness in practice depends heavily on the quality of staff training and customer engagement, areas where Lebara has been criticised for underperformance.</w:t>
+      </w:r>
+    </w:p>
+    <w:p>
+      <w:pPr>
+        <w:jc w:val="both"/>
+        <w:rPr>
+          <w:rFonts w:ascii="Arial" w:hAnsi="Arial" w:cs="Arial"/>
+        </w:rPr>
+      </w:pPr>
+      <w:r>
+        <w:rPr>
+          <w:rFonts w:ascii="Arial" w:hAnsi="Arial" w:cs="Arial"/>
+        </w:rPr>
+        <w:t xml:space="preserve">A significant aspect of Lebara’s plan is its </w:t>
+      </w:r>
+      <w:r>
+        <w:rPr>
+          <w:rFonts w:ascii="Arial" w:hAnsi="Arial" w:cs="Arial"/>
+          <w:b/>
+          <w:bCs/>
+        </w:rPr>
+        <w:t>commitment to emergency accessibility</w:t>
+      </w:r>
+      <w:r>
+        <w:rPr>
+          <w:rFonts w:ascii="Arial" w:hAnsi="Arial" w:cs="Arial"/>
+        </w:rPr>
+        <w:t xml:space="preserve">. The company ensures that customers using approved devices with a Lebara SIM can make calls to Triple Zero (000). This aligns with national standards requiring universal </w:t>
+      </w:r>
+      <w:r>
+        <w:rPr>
+          <w:rFonts w:ascii="Arial" w:hAnsi="Arial" w:cs="Arial"/>
+        </w:rPr>
         <w:lastRenderedPageBreak/>
-        <w:t xml:space="preserve">Lebara also provides consumer-centric procedures for </w:t>
-      </w:r>
-      <w:r>
-        <w:rPr>
-          <w:rFonts w:ascii="Arial" w:hAnsi="Arial" w:cs="Arial"/>
-          <w:b/>
-          <w:bCs/>
-        </w:rPr>
-        <w:t>complaints handling</w:t>
-      </w:r>
-      <w:r>
-        <w:rPr>
-          <w:rFonts w:ascii="Arial" w:hAnsi="Arial" w:cs="Arial"/>
-        </w:rPr>
-        <w:t>, including network outage complaints. These processes, overseen by ACMA’s regulatory requirements, are intended to improve transparency and accountability. However, past consumer grievances highlight weaknesses in Lebara’s responsiveness to complaints. While the existence of these mechanisms is a regulatory necessity, their effectiveness in practice depends heavily on the quality of staff training and customer engagement, areas where Lebara has been criticised for underperformance.</w:t>
-      </w:r>
-    </w:p>
-    <w:p>
-      <w:pPr>
-        <w:jc w:val="both"/>
-        <w:rPr>
-          <w:rFonts w:ascii="Arial" w:hAnsi="Arial" w:cs="Arial"/>
-        </w:rPr>
-      </w:pPr>
-      <w:r>
-        <w:rPr>
-          <w:rFonts w:ascii="Arial" w:hAnsi="Arial" w:cs="Arial"/>
-        </w:rPr>
-        <w:t xml:space="preserve">A significant aspect of Lebara’s plan is its </w:t>
-      </w:r>
-      <w:r>
-        <w:rPr>
-          <w:rFonts w:ascii="Arial" w:hAnsi="Arial" w:cs="Arial"/>
-          <w:b/>
-          <w:bCs/>
-        </w:rPr>
-        <w:t>commitment to emergency accessibility</w:t>
-      </w:r>
-      <w:r>
-        <w:rPr>
-          <w:rFonts w:ascii="Arial" w:hAnsi="Arial" w:cs="Arial"/>
-        </w:rPr>
-        <w:t>. The company ensures that customers using approved devices with a Lebara SIM can make calls to Triple Zero (000). This aligns with national standards requiring universal access to emergency services, regardless of a customer’s geographic or financial circumstances.</w:t>
+        <w:t>access to emergency services, regardless of a customer’s geographic or financial circumstances.</w:t>
       </w:r>
     </w:p>
     <w:p>
@@ -1267,67 +1375,61 @@
         <w:rPr>
           <w:rFonts w:ascii="Arial" w:hAnsi="Arial" w:cs="Arial"/>
         </w:rPr>
-        <w:t xml:space="preserve"> in strengthening its Support and Accessibility Plan lies in bridging the gap between policy and practice. Enhancing staff training, investing in more robust customer support infrastructure, and proactively addressing consumer complaints would ensure that its accessibility initiatives move beyond compliance and become a genuine competitive advantage. If executed effectively, these measures </w:t>
-      </w:r>
+        <w:t xml:space="preserve"> in strengthening its Support and Accessibility Plan lies in bridging the gap between policy and practice. Enhancing staff training, investing in more robust customer support infrastructure, and proactively addressing consumer complaints would ensure that its accessibility initiatives move beyond compliance and become a genuine competitive advantage. If executed effectively, these measures could help Lebara shift its reputation from one marked by poor service experiences to one recognised for inclusive and reliable accessibility.</w:t>
+      </w:r>
+    </w:p>
+    <w:p>
+      <w:pPr>
+        <w:jc w:val="both"/>
+        <w:rPr>
+          <w:rFonts w:ascii="Arial" w:hAnsi="Arial" w:cs="Arial"/>
+        </w:rPr>
+      </w:pPr>
+    </w:p>
+    <w:p>
+      <w:pPr>
+        <w:jc w:val="both"/>
+        <w:rPr>
+          <w:rFonts w:ascii="Arial" w:hAnsi="Arial" w:cs="Arial"/>
+          <w:b/>
+          <w:bCs/>
+        </w:rPr>
+      </w:pPr>
+      <w:r>
+        <w:rPr>
+          <w:rFonts w:ascii="Arial" w:hAnsi="Arial" w:cs="Arial"/>
+          <w:b/>
+          <w:bCs/>
+        </w:rPr>
+        <w:t>How regulatory and legislative requirements impact accessibility</w:t>
+      </w:r>
+    </w:p>
+    <w:p>
+      <w:pPr>
+        <w:jc w:val="both"/>
+        <w:rPr>
+          <w:rFonts w:ascii="Arial" w:hAnsi="Arial" w:cs="Arial"/>
+        </w:rPr>
+      </w:pPr>
+      <w:r>
+        <w:rPr>
+          <w:rFonts w:ascii="Arial" w:hAnsi="Arial" w:cs="Arial"/>
+        </w:rPr>
+        <w:t>Regulatory and legislative requirements shape the accessibility of telecommunications networks in Australia by setting minimum standards, ensuring consumer protection, and balancing commercial innovation with public interest obligations. For carriers and service providers alike, these frameworks influence not only how networks are planned and deployed but also how services are delivered to individuals and organisations across diverse geographic and social contexts.</w:t>
+      </w:r>
+    </w:p>
+    <w:p>
+      <w:pPr>
+        <w:jc w:val="both"/>
+        <w:rPr>
+          <w:rFonts w:ascii="Arial" w:hAnsi="Arial" w:cs="Arial"/>
+        </w:rPr>
+      </w:pPr>
       <w:r>
         <w:rPr>
           <w:rFonts w:ascii="Arial" w:hAnsi="Arial" w:cs="Arial"/>
         </w:rPr>
         <w:lastRenderedPageBreak/>
-        <w:t>could help Lebara shift its reputation from one marked by poor service experiences to one recognised for inclusive and reliable accessibility.</w:t>
-      </w:r>
-    </w:p>
-    <w:p>
-      <w:pPr>
-        <w:jc w:val="both"/>
-        <w:rPr>
-          <w:rFonts w:ascii="Arial" w:hAnsi="Arial" w:cs="Arial"/>
-        </w:rPr>
-      </w:pPr>
-    </w:p>
-    <w:p>
-      <w:pPr>
-        <w:jc w:val="both"/>
-        <w:rPr>
-          <w:rFonts w:ascii="Arial" w:hAnsi="Arial" w:cs="Arial"/>
-          <w:b/>
-          <w:bCs/>
-        </w:rPr>
-      </w:pPr>
-      <w:r>
-        <w:rPr>
-          <w:rFonts w:ascii="Arial" w:hAnsi="Arial" w:cs="Arial"/>
-          <w:b/>
-          <w:bCs/>
-        </w:rPr>
-        <w:t>How regulatory and legislative requirements impact accessibility</w:t>
-      </w:r>
-    </w:p>
-    <w:p>
-      <w:pPr>
-        <w:jc w:val="both"/>
-        <w:rPr>
-          <w:rFonts w:ascii="Arial" w:hAnsi="Arial" w:cs="Arial"/>
-        </w:rPr>
-      </w:pPr>
-      <w:r>
-        <w:rPr>
-          <w:rFonts w:ascii="Arial" w:hAnsi="Arial" w:cs="Arial"/>
-        </w:rPr>
-        <w:t>Regulatory and legislative requirements shape the accessibility of telecommunications networks in Australia by setting minimum standards, ensuring consumer protection, and balancing commercial innovation with public interest obligations. For carriers and service providers alike, these frameworks influence not only how networks are planned and deployed but also how services are delivered to individuals and organisations across diverse geographic and social contexts.</w:t>
-      </w:r>
-    </w:p>
-    <w:p>
-      <w:pPr>
-        <w:jc w:val="both"/>
-        <w:rPr>
-          <w:rFonts w:ascii="Arial" w:hAnsi="Arial" w:cs="Arial"/>
-        </w:rPr>
-      </w:pPr>
-      <w:r>
-        <w:rPr>
-          <w:rFonts w:ascii="Arial" w:hAnsi="Arial" w:cs="Arial"/>
-        </w:rPr>
         <w:t xml:space="preserve">The </w:t>
       </w:r>
       <w:r>
@@ -1426,14 +1528,7 @@
         <w:rPr>
           <w:rFonts w:ascii="Arial" w:hAnsi="Arial" w:cs="Arial"/>
         </w:rPr>
-        <w:t xml:space="preserve"> is central to ensuring that no single provider abuses market power. It has a direct impact on accessibility by preventing monopolistic practices that could otherwise limit consumer choice, inflate prices, or stifle investment in infrastructure for rural and remote regions. In practice, this legislation promotes innovation and drives providers to improve service quality and coverage. For MVNOs </w:t>
-      </w:r>
-      <w:r>
-        <w:rPr>
-          <w:rFonts w:ascii="Arial" w:hAnsi="Arial" w:cs="Arial"/>
-        </w:rPr>
-        <w:lastRenderedPageBreak/>
-        <w:t>such as Lebara, it ensures fair access to wholesale networks, enabling them to deliver affordable services to their target markets.</w:t>
+        <w:t xml:space="preserve"> is central to ensuring that no single provider abuses market power. It has a direct impact on accessibility by preventing monopolistic practices that could otherwise limit consumer choice, inflate prices, or stifle investment in infrastructure for rural and remote regions. In practice, this legislation promotes innovation and drives providers to improve service quality and coverage. For MVNOs such as Lebara, it ensures fair access to wholesale networks, enabling them to deliver affordable services to their target markets.</w:t>
       </w:r>
     </w:p>
     <w:p>
@@ -1475,7 +1570,14 @@
         <w:rPr>
           <w:rFonts w:ascii="Arial" w:hAnsi="Arial" w:cs="Arial"/>
         </w:rPr>
-        <w:t>Together, these legislative frameworks ensure that accessibility is not determined solely by market dynamics. They provide a regulatory safety net that obliges providers to balance profitability with inclusivity, security, and fairness—ensuring that telecommunications remains a universal service rather than a privilege confined to profitable demographics or locations.</w:t>
+        <w:t xml:space="preserve">Together, these legislative frameworks ensure that accessibility is not determined solely by market dynamics. They provide a regulatory safety net that obliges providers to balance profitability with inclusivity, security, and fairness—ensuring that </w:t>
+      </w:r>
+      <w:r>
+        <w:rPr>
+          <w:rFonts w:ascii="Arial" w:hAnsi="Arial" w:cs="Arial"/>
+        </w:rPr>
+        <w:lastRenderedPageBreak/>
+        <w:t>telecommunications remains a universal service rather than a privilege confined to profitable demographics or locations.</w:t>
       </w:r>
     </w:p>
     <w:p>
@@ -3800,6 +3902,7 @@
   <w:style w:type="character" w:default="1" w:styleId="DefaultParagraphFont">
     <w:name w:val="Default Paragraph Font"/>
     <w:uiPriority w:val="1"/>
+    <w:semiHidden/>
     <w:unhideWhenUsed/>
   </w:style>
   <w:style w:type="table" w:default="1" w:styleId="TableNormal">

</xml_diff>